<commit_message>
Years of experience corrected. New pdf and docx are loaded to docs folder
</commit_message>
<xml_diff>
--- a/docs/resume-kaviyarasan-aug26.docx
+++ b/docs/resume-kaviyarasan-aug26.docx
@@ -1,6 +1,6 @@
 
 <file path=word/document.xml><?xml version="1.0" encoding="utf-8"?>
-<w:document xmlns:wpc="http://schemas.microsoft.com/office/word/2010/wordprocessingCanvas" xmlns:cx="http://schemas.microsoft.com/office/drawing/2014/chartex" xmlns:cx1="http://schemas.microsoft.com/office/drawing/2015/9/8/chartex" xmlns:cx2="http://schemas.microsoft.com/office/drawing/2015/10/21/chartex" xmlns:cx3="http://schemas.microsoft.com/office/drawing/2016/5/9/chartex" xmlns:cx4="http://schemas.microsoft.com/office/drawing/2016/5/10/chartex" xmlns:cx5="http://schemas.microsoft.com/office/drawing/2016/5/11/chartex" xmlns:cx6="http://schemas.microsoft.com/office/drawing/2016/5/12/chartex" xmlns:cx7="http://schemas.microsoft.com/office/drawing/2016/5/13/chartex" xmlns:cx8="http://schemas.microsoft.com/office/drawing/2016/5/14/chartex" xmlns:mc="http://schemas.openxmlformats.org/markup-compatibility/2006" xmlns:aink="http://schemas.microsoft.com/office/drawing/2016/ink" xmlns:am3d="http://schemas.microsoft.com/office/drawing/2017/model3d" xmlns:o="urn:schemas-microsoft-com:office:office" xmlns:oel="http://schemas.microsoft.com/office/2019/extlst" xmlns:r="http://schemas.openxmlformats.org/officeDocument/2006/relationships" xmlns:m="http://schemas.openxmlformats.org/officeDocument/2006/math" xmlns:v="urn:schemas-microsoft-com:vml" xmlns:wp14="http://schemas.microsoft.com/office/word/2010/wordprocessingDrawing" xmlns:wp="http://schemas.openxmlformats.org/drawingml/2006/wordprocessingDrawing" xmlns:w10="urn:schemas-microsoft-com:office:word" xmlns:w="http://schemas.openxmlformats.org/wordprocessingml/2006/main" xmlns:w14="http://schemas.microsoft.com/office/word/2010/wordml" xmlns:w15="http://schemas.microsoft.com/office/word/2012/wordml" xmlns:w16cex="http://schemas.microsoft.com/office/word/2018/wordml/cex" xmlns:w16cid="http://schemas.microsoft.com/office/word/2016/wordml/cid" xmlns:w16="http://schemas.microsoft.com/office/word/2018/wordml" xmlns:w16du="http://schemas.microsoft.com/office/word/2023/wordml/word16du" xmlns:w16sdtdh="http://schemas.microsoft.com/office/word/2020/wordml/sdtdatahash" xmlns:w16sdtfl="http://schemas.microsoft.com/office/word/2024/wordml/sdtformatlock" xmlns:w16se="http://schemas.microsoft.com/office/word/2015/wordml/symex" xmlns:wpg="http://schemas.microsoft.com/office/word/2010/wordprocessingGroup" xmlns:wpi="http://schemas.microsoft.com/office/word/2010/wordprocessingInk" xmlns:wne="http://schemas.microsoft.com/office/word/2006/wordml" xmlns:wps="http://schemas.microsoft.com/office/word/2010/wordprocessingShape" mc:Ignorable="w14 w15 w16se w16cid w16 w16cex w16sdtdh w16sdtfl w16du wp14">
+<w:document xmlns:wpc="http://schemas.microsoft.com/office/word/2010/wordprocessingCanvas" xmlns:cx="http://schemas.microsoft.com/office/drawing/2014/chartex" xmlns:cx1="http://schemas.microsoft.com/office/drawing/2015/9/8/chartex" xmlns:cx2="http://schemas.microsoft.com/office/drawing/2015/10/21/chartex" xmlns:cx3="http://schemas.microsoft.com/office/drawing/2016/5/9/chartex" xmlns:cx4="http://schemas.microsoft.com/office/drawing/2016/5/10/chartex" xmlns:cx5="http://schemas.microsoft.com/office/drawing/2016/5/11/chartex" xmlns:cx6="http://schemas.microsoft.com/office/drawing/2016/5/12/chartex" xmlns:cx7="http://schemas.microsoft.com/office/drawing/2016/5/13/chartex" xmlns:cx8="http://schemas.microsoft.com/office/drawing/2016/5/14/chartex" xmlns:mc="http://schemas.openxmlformats.org/markup-compatibility/2006" xmlns:aink="http://schemas.microsoft.com/office/drawing/2016/ink" xmlns:am3d="http://schemas.microsoft.com/office/drawing/2017/model3d" xmlns:o="urn:schemas-microsoft-com:office:office" xmlns:oel="http://schemas.microsoft.com/office/2019/extlst" xmlns:r="http://schemas.openxmlformats.org/officeDocument/2006/relationships" xmlns:m="http://schemas.openxmlformats.org/officeDocument/2006/math" xmlns:v="urn:schemas-microsoft-com:vml" xmlns:wp14="http://schemas.microsoft.com/office/word/2010/wordprocessingDrawing" xmlns:wp="http://schemas.openxmlformats.org/drawingml/2006/wordprocessingDrawing" xmlns:w10="urn:schemas-microsoft-com:office:word" xmlns:w="http://schemas.openxmlformats.org/wordprocessingml/2006/main" xmlns:w14="http://schemas.microsoft.com/office/word/2010/wordml" xmlns:w15="http://schemas.microsoft.com/office/word/2012/wordml" xmlns:w16cei="http://schemas.microsoft.com/office/word/2026/wordml/cei" xmlns:w16cex="http://schemas.microsoft.com/office/word/2018/wordml/cex" xmlns:w16cid="http://schemas.microsoft.com/office/word/2016/wordml/cid" xmlns:w16="http://schemas.microsoft.com/office/word/2018/wordml" xmlns:w16du="http://schemas.microsoft.com/office/word/2023/wordml/word16du" xmlns:w16sdtdh="http://schemas.microsoft.com/office/word/2020/wordml/sdtdatahash" xmlns:w16sdtfl="http://schemas.microsoft.com/office/word/2024/wordml/sdtformatlock" xmlns:w16se="http://schemas.microsoft.com/office/word/2015/wordml/symex" xmlns:wpg="http://schemas.microsoft.com/office/word/2010/wordprocessingGroup" xmlns:wpi="http://schemas.microsoft.com/office/word/2010/wordprocessingInk" xmlns:wne="http://schemas.microsoft.com/office/word/2006/wordml" xmlns:wps="http://schemas.microsoft.com/office/word/2010/wordprocessingShape" mc:Ignorable="w14 w15 w16se w16cid w16 w16cex w16sdtdh w16sdtfl w16du wp14">
   <w:body>
     <w:p>
       <w:pPr>
@@ -516,7 +516,7 @@
                                 <w:rFonts w:cstheme="minorHAnsi"/>
                                 <w:color w:val="000000" w:themeColor="text1"/>
                               </w:rPr>
-                              <w:t>7</w:t>
+                              <w:t>8</w:t>
                             </w:r>
                             <w:r>
                               <w:rPr>
@@ -631,7 +631,7 @@
                           <w:rFonts w:cstheme="minorHAnsi"/>
                           <w:color w:val="000000" w:themeColor="text1"/>
                         </w:rPr>
-                        <w:t>7</w:t>
+                        <w:t>8</w:t>
                       </w:r>
                       <w:r>
                         <w:rPr>
@@ -956,7 +956,7 @@
                                   <w:sz w:val="36"/>
                                   <w:szCs w:val="36"/>
                                 </w:rPr>
-                                <w:t>7</w:t>
+                                <w:t>8</w:t>
                               </w:r>
                               <w:r>
                                 <w:rPr>
@@ -1442,7 +1442,7 @@
                             <w:sz w:val="36"/>
                             <w:szCs w:val="36"/>
                           </w:rPr>
-                          <w:t>7</w:t>
+                          <w:t>8</w:t>
                         </w:r>
                         <w:r>
                           <w:rPr>
@@ -6023,7 +6023,7 @@
           <w:szCs w:val="32"/>
         </w:rPr>
         <w:drawing>
-          <wp:anchor distT="0" distB="0" distL="114300" distR="114300" simplePos="0" relativeHeight="251827200" behindDoc="0" locked="0" layoutInCell="1" allowOverlap="1" wp14:anchorId="6565B8FC" wp14:editId="0A0E40EB">
+          <wp:anchor distT="0" distB="0" distL="114300" distR="114300" simplePos="0" relativeHeight="251827200" behindDoc="0" locked="0" layoutInCell="1" allowOverlap="1" wp14:anchorId="6565B8FC" wp14:editId="7C2DFFF3">
             <wp:simplePos x="0" y="0"/>
             <wp:positionH relativeFrom="margin">
               <wp:posOffset>1974850</wp:posOffset>
@@ -12335,7 +12335,7 @@
 </file>
 
 <file path=word/endnotes.xml><?xml version="1.0" encoding="utf-8"?>
-<w:endnotes xmlns:wpc="http://schemas.microsoft.com/office/word/2010/wordprocessingCanvas" xmlns:cx="http://schemas.microsoft.com/office/drawing/2014/chartex" xmlns:cx1="http://schemas.microsoft.com/office/drawing/2015/9/8/chartex" xmlns:cx2="http://schemas.microsoft.com/office/drawing/2015/10/21/chartex" xmlns:cx3="http://schemas.microsoft.com/office/drawing/2016/5/9/chartex" xmlns:cx4="http://schemas.microsoft.com/office/drawing/2016/5/10/chartex" xmlns:cx5="http://schemas.microsoft.com/office/drawing/2016/5/11/chartex" xmlns:cx6="http://schemas.microsoft.com/office/drawing/2016/5/12/chartex" xmlns:cx7="http://schemas.microsoft.com/office/drawing/2016/5/13/chartex" xmlns:cx8="http://schemas.microsoft.com/office/drawing/2016/5/14/chartex" xmlns:mc="http://schemas.openxmlformats.org/markup-compatibility/2006" xmlns:aink="http://schemas.microsoft.com/office/drawing/2016/ink" xmlns:am3d="http://schemas.microsoft.com/office/drawing/2017/model3d" xmlns:o="urn:schemas-microsoft-com:office:office" xmlns:oel="http://schemas.microsoft.com/office/2019/extlst" xmlns:r="http://schemas.openxmlformats.org/officeDocument/2006/relationships" xmlns:m="http://schemas.openxmlformats.org/officeDocument/2006/math" xmlns:v="urn:schemas-microsoft-com:vml" xmlns:wp14="http://schemas.microsoft.com/office/word/2010/wordprocessingDrawing" xmlns:wp="http://schemas.openxmlformats.org/drawingml/2006/wordprocessingDrawing" xmlns:w10="urn:schemas-microsoft-com:office:word" xmlns:w="http://schemas.openxmlformats.org/wordprocessingml/2006/main" xmlns:w14="http://schemas.microsoft.com/office/word/2010/wordml" xmlns:w15="http://schemas.microsoft.com/office/word/2012/wordml" xmlns:w16cex="http://schemas.microsoft.com/office/word/2018/wordml/cex" xmlns:w16cid="http://schemas.microsoft.com/office/word/2016/wordml/cid" xmlns:w16="http://schemas.microsoft.com/office/word/2018/wordml" xmlns:w16du="http://schemas.microsoft.com/office/word/2023/wordml/word16du" xmlns:w16sdtdh="http://schemas.microsoft.com/office/word/2020/wordml/sdtdatahash" xmlns:w16sdtfl="http://schemas.microsoft.com/office/word/2024/wordml/sdtformatlock" xmlns:w16se="http://schemas.microsoft.com/office/word/2015/wordml/symex" xmlns:wpg="http://schemas.microsoft.com/office/word/2010/wordprocessingGroup" xmlns:wpi="http://schemas.microsoft.com/office/word/2010/wordprocessingInk" xmlns:wne="http://schemas.microsoft.com/office/word/2006/wordml" xmlns:wps="http://schemas.microsoft.com/office/word/2010/wordprocessingShape" mc:Ignorable="w14 w15 w16se w16cid w16 w16cex w16sdtdh w16sdtfl w16du wp14">
+<w:endnotes xmlns:wpc="http://schemas.microsoft.com/office/word/2010/wordprocessingCanvas" xmlns:cx="http://schemas.microsoft.com/office/drawing/2014/chartex" xmlns:cx1="http://schemas.microsoft.com/office/drawing/2015/9/8/chartex" xmlns:cx2="http://schemas.microsoft.com/office/drawing/2015/10/21/chartex" xmlns:cx3="http://schemas.microsoft.com/office/drawing/2016/5/9/chartex" xmlns:cx4="http://schemas.microsoft.com/office/drawing/2016/5/10/chartex" xmlns:cx5="http://schemas.microsoft.com/office/drawing/2016/5/11/chartex" xmlns:cx6="http://schemas.microsoft.com/office/drawing/2016/5/12/chartex" xmlns:cx7="http://schemas.microsoft.com/office/drawing/2016/5/13/chartex" xmlns:cx8="http://schemas.microsoft.com/office/drawing/2016/5/14/chartex" xmlns:mc="http://schemas.openxmlformats.org/markup-compatibility/2006" xmlns:aink="http://schemas.microsoft.com/office/drawing/2016/ink" xmlns:am3d="http://schemas.microsoft.com/office/drawing/2017/model3d" xmlns:o="urn:schemas-microsoft-com:office:office" xmlns:oel="http://schemas.microsoft.com/office/2019/extlst" xmlns:r="http://schemas.openxmlformats.org/officeDocument/2006/relationships" xmlns:m="http://schemas.openxmlformats.org/officeDocument/2006/math" xmlns:v="urn:schemas-microsoft-com:vml" xmlns:wp14="http://schemas.microsoft.com/office/word/2010/wordprocessingDrawing" xmlns:wp="http://schemas.openxmlformats.org/drawingml/2006/wordprocessingDrawing" xmlns:w10="urn:schemas-microsoft-com:office:word" xmlns:w="http://schemas.openxmlformats.org/wordprocessingml/2006/main" xmlns:w14="http://schemas.microsoft.com/office/word/2010/wordml" xmlns:w15="http://schemas.microsoft.com/office/word/2012/wordml" xmlns:w16cei="http://schemas.microsoft.com/office/word/2026/wordml/cei" xmlns:w16cex="http://schemas.microsoft.com/office/word/2018/wordml/cex" xmlns:w16cid="http://schemas.microsoft.com/office/word/2016/wordml/cid" xmlns:w16="http://schemas.microsoft.com/office/word/2018/wordml" xmlns:w16du="http://schemas.microsoft.com/office/word/2023/wordml/word16du" xmlns:w16sdtdh="http://schemas.microsoft.com/office/word/2020/wordml/sdtdatahash" xmlns:w16sdtfl="http://schemas.microsoft.com/office/word/2024/wordml/sdtformatlock" xmlns:w16se="http://schemas.microsoft.com/office/word/2015/wordml/symex" xmlns:wpg="http://schemas.microsoft.com/office/word/2010/wordprocessingGroup" xmlns:wpi="http://schemas.microsoft.com/office/word/2010/wordprocessingInk" xmlns:wne="http://schemas.microsoft.com/office/word/2006/wordml" xmlns:wps="http://schemas.microsoft.com/office/word/2010/wordprocessingShape" mc:Ignorable="w14 w15 w16se w16cid w16 w16cex w16sdtdh w16sdtfl w16du wp14">
   <w:endnote w:type="separator" w:id="-1">
     <w:p>
       <w:pPr>
@@ -12360,7 +12360,7 @@
 </file>
 
 <file path=word/footnotes.xml><?xml version="1.0" encoding="utf-8"?>
-<w:footnotes xmlns:wpc="http://schemas.microsoft.com/office/word/2010/wordprocessingCanvas" xmlns:cx="http://schemas.microsoft.com/office/drawing/2014/chartex" xmlns:cx1="http://schemas.microsoft.com/office/drawing/2015/9/8/chartex" xmlns:cx2="http://schemas.microsoft.com/office/drawing/2015/10/21/chartex" xmlns:cx3="http://schemas.microsoft.com/office/drawing/2016/5/9/chartex" xmlns:cx4="http://schemas.microsoft.com/office/drawing/2016/5/10/chartex" xmlns:cx5="http://schemas.microsoft.com/office/drawing/2016/5/11/chartex" xmlns:cx6="http://schemas.microsoft.com/office/drawing/2016/5/12/chartex" xmlns:cx7="http://schemas.microsoft.com/office/drawing/2016/5/13/chartex" xmlns:cx8="http://schemas.microsoft.com/office/drawing/2016/5/14/chartex" xmlns:mc="http://schemas.openxmlformats.org/markup-compatibility/2006" xmlns:aink="http://schemas.microsoft.com/office/drawing/2016/ink" xmlns:am3d="http://schemas.microsoft.com/office/drawing/2017/model3d" xmlns:o="urn:schemas-microsoft-com:office:office" xmlns:oel="http://schemas.microsoft.com/office/2019/extlst" xmlns:r="http://schemas.openxmlformats.org/officeDocument/2006/relationships" xmlns:m="http://schemas.openxmlformats.org/officeDocument/2006/math" xmlns:v="urn:schemas-microsoft-com:vml" xmlns:wp14="http://schemas.microsoft.com/office/word/2010/wordprocessingDrawing" xmlns:wp="http://schemas.openxmlformats.org/drawingml/2006/wordprocessingDrawing" xmlns:w10="urn:schemas-microsoft-com:office:word" xmlns:w="http://schemas.openxmlformats.org/wordprocessingml/2006/main" xmlns:w14="http://schemas.microsoft.com/office/word/2010/wordml" xmlns:w15="http://schemas.microsoft.com/office/word/2012/wordml" xmlns:w16cex="http://schemas.microsoft.com/office/word/2018/wordml/cex" xmlns:w16cid="http://schemas.microsoft.com/office/word/2016/wordml/cid" xmlns:w16="http://schemas.microsoft.com/office/word/2018/wordml" xmlns:w16du="http://schemas.microsoft.com/office/word/2023/wordml/word16du" xmlns:w16sdtdh="http://schemas.microsoft.com/office/word/2020/wordml/sdtdatahash" xmlns:w16sdtfl="http://schemas.microsoft.com/office/word/2024/wordml/sdtformatlock" xmlns:w16se="http://schemas.microsoft.com/office/word/2015/wordml/symex" xmlns:wpg="http://schemas.microsoft.com/office/word/2010/wordprocessingGroup" xmlns:wpi="http://schemas.microsoft.com/office/word/2010/wordprocessingInk" xmlns:wne="http://schemas.microsoft.com/office/word/2006/wordml" xmlns:wps="http://schemas.microsoft.com/office/word/2010/wordprocessingShape" mc:Ignorable="w14 w15 w16se w16cid w16 w16cex w16sdtdh w16sdtfl w16du wp14">
+<w:footnotes xmlns:wpc="http://schemas.microsoft.com/office/word/2010/wordprocessingCanvas" xmlns:cx="http://schemas.microsoft.com/office/drawing/2014/chartex" xmlns:cx1="http://schemas.microsoft.com/office/drawing/2015/9/8/chartex" xmlns:cx2="http://schemas.microsoft.com/office/drawing/2015/10/21/chartex" xmlns:cx3="http://schemas.microsoft.com/office/drawing/2016/5/9/chartex" xmlns:cx4="http://schemas.microsoft.com/office/drawing/2016/5/10/chartex" xmlns:cx5="http://schemas.microsoft.com/office/drawing/2016/5/11/chartex" xmlns:cx6="http://schemas.microsoft.com/office/drawing/2016/5/12/chartex" xmlns:cx7="http://schemas.microsoft.com/office/drawing/2016/5/13/chartex" xmlns:cx8="http://schemas.microsoft.com/office/drawing/2016/5/14/chartex" xmlns:mc="http://schemas.openxmlformats.org/markup-compatibility/2006" xmlns:aink="http://schemas.microsoft.com/office/drawing/2016/ink" xmlns:am3d="http://schemas.microsoft.com/office/drawing/2017/model3d" xmlns:o="urn:schemas-microsoft-com:office:office" xmlns:oel="http://schemas.microsoft.com/office/2019/extlst" xmlns:r="http://schemas.openxmlformats.org/officeDocument/2006/relationships" xmlns:m="http://schemas.openxmlformats.org/officeDocument/2006/math" xmlns:v="urn:schemas-microsoft-com:vml" xmlns:wp14="http://schemas.microsoft.com/office/word/2010/wordprocessingDrawing" xmlns:wp="http://schemas.openxmlformats.org/drawingml/2006/wordprocessingDrawing" xmlns:w10="urn:schemas-microsoft-com:office:word" xmlns:w="http://schemas.openxmlformats.org/wordprocessingml/2006/main" xmlns:w14="http://schemas.microsoft.com/office/word/2010/wordml" xmlns:w15="http://schemas.microsoft.com/office/word/2012/wordml" xmlns:w16cei="http://schemas.microsoft.com/office/word/2026/wordml/cei" xmlns:w16cex="http://schemas.microsoft.com/office/word/2018/wordml/cex" xmlns:w16cid="http://schemas.microsoft.com/office/word/2016/wordml/cid" xmlns:w16="http://schemas.microsoft.com/office/word/2018/wordml" xmlns:w16du="http://schemas.microsoft.com/office/word/2023/wordml/word16du" xmlns:w16sdtdh="http://schemas.microsoft.com/office/word/2020/wordml/sdtdatahash" xmlns:w16sdtfl="http://schemas.microsoft.com/office/word/2024/wordml/sdtformatlock" xmlns:w16se="http://schemas.microsoft.com/office/word/2015/wordml/symex" xmlns:wpg="http://schemas.microsoft.com/office/word/2010/wordprocessingGroup" xmlns:wpi="http://schemas.microsoft.com/office/word/2010/wordprocessingInk" xmlns:wne="http://schemas.microsoft.com/office/word/2006/wordml" xmlns:wps="http://schemas.microsoft.com/office/word/2010/wordprocessingShape" mc:Ignorable="w14 w15 w16se w16cid w16 w16cex w16sdtdh w16sdtfl w16du wp14">
   <w:footnote w:type="separator" w:id="-1">
     <w:p>
       <w:pPr>
@@ -12385,7 +12385,7 @@
 </file>
 
 <file path=word/numbering.xml><?xml version="1.0" encoding="utf-8"?>
-<w:numbering xmlns:wpc="http://schemas.microsoft.com/office/word/2010/wordprocessingCanvas" xmlns:cx="http://schemas.microsoft.com/office/drawing/2014/chartex" xmlns:cx1="http://schemas.microsoft.com/office/drawing/2015/9/8/chartex" xmlns:cx2="http://schemas.microsoft.com/office/drawing/2015/10/21/chartex" xmlns:cx3="http://schemas.microsoft.com/office/drawing/2016/5/9/chartex" xmlns:cx4="http://schemas.microsoft.com/office/drawing/2016/5/10/chartex" xmlns:cx5="http://schemas.microsoft.com/office/drawing/2016/5/11/chartex" xmlns:cx6="http://schemas.microsoft.com/office/drawing/2016/5/12/chartex" xmlns:cx7="http://schemas.microsoft.com/office/drawing/2016/5/13/chartex" xmlns:cx8="http://schemas.microsoft.com/office/drawing/2016/5/14/chartex" xmlns:mc="http://schemas.openxmlformats.org/markup-compatibility/2006" xmlns:aink="http://schemas.microsoft.com/office/drawing/2016/ink" xmlns:am3d="http://schemas.microsoft.com/office/drawing/2017/model3d" xmlns:o="urn:schemas-microsoft-com:office:office" xmlns:oel="http://schemas.microsoft.com/office/2019/extlst" xmlns:r="http://schemas.openxmlformats.org/officeDocument/2006/relationships" xmlns:m="http://schemas.openxmlformats.org/officeDocument/2006/math" xmlns:v="urn:schemas-microsoft-com:vml" xmlns:wp14="http://schemas.microsoft.com/office/word/2010/wordprocessingDrawing" xmlns:wp="http://schemas.openxmlformats.org/drawingml/2006/wordprocessingDrawing" xmlns:w10="urn:schemas-microsoft-com:office:word" xmlns:w="http://schemas.openxmlformats.org/wordprocessingml/2006/main" xmlns:w14="http://schemas.microsoft.com/office/word/2010/wordml" xmlns:w15="http://schemas.microsoft.com/office/word/2012/wordml" xmlns:w16cex="http://schemas.microsoft.com/office/word/2018/wordml/cex" xmlns:w16cid="http://schemas.microsoft.com/office/word/2016/wordml/cid" xmlns:w16="http://schemas.microsoft.com/office/word/2018/wordml" xmlns:w16du="http://schemas.microsoft.com/office/word/2023/wordml/word16du" xmlns:w16sdtdh="http://schemas.microsoft.com/office/word/2020/wordml/sdtdatahash" xmlns:w16sdtfl="http://schemas.microsoft.com/office/word/2024/wordml/sdtformatlock" xmlns:w16se="http://schemas.microsoft.com/office/word/2015/wordml/symex" xmlns:wpg="http://schemas.microsoft.com/office/word/2010/wordprocessingGroup" xmlns:wpi="http://schemas.microsoft.com/office/word/2010/wordprocessingInk" xmlns:wne="http://schemas.microsoft.com/office/word/2006/wordml" xmlns:wps="http://schemas.microsoft.com/office/word/2010/wordprocessingShape" mc:Ignorable="w14 w15 w16se w16cid w16 w16cex w16sdtdh w16sdtfl w16du wp14">
+<w:numbering xmlns:wpc="http://schemas.microsoft.com/office/word/2010/wordprocessingCanvas" xmlns:cx="http://schemas.microsoft.com/office/drawing/2014/chartex" xmlns:cx1="http://schemas.microsoft.com/office/drawing/2015/9/8/chartex" xmlns:cx2="http://schemas.microsoft.com/office/drawing/2015/10/21/chartex" xmlns:cx3="http://schemas.microsoft.com/office/drawing/2016/5/9/chartex" xmlns:cx4="http://schemas.microsoft.com/office/drawing/2016/5/10/chartex" xmlns:cx5="http://schemas.microsoft.com/office/drawing/2016/5/11/chartex" xmlns:cx6="http://schemas.microsoft.com/office/drawing/2016/5/12/chartex" xmlns:cx7="http://schemas.microsoft.com/office/drawing/2016/5/13/chartex" xmlns:cx8="http://schemas.microsoft.com/office/drawing/2016/5/14/chartex" xmlns:mc="http://schemas.openxmlformats.org/markup-compatibility/2006" xmlns:aink="http://schemas.microsoft.com/office/drawing/2016/ink" xmlns:am3d="http://schemas.microsoft.com/office/drawing/2017/model3d" xmlns:o="urn:schemas-microsoft-com:office:office" xmlns:oel="http://schemas.microsoft.com/office/2019/extlst" xmlns:r="http://schemas.openxmlformats.org/officeDocument/2006/relationships" xmlns:m="http://schemas.openxmlformats.org/officeDocument/2006/math" xmlns:v="urn:schemas-microsoft-com:vml" xmlns:wp14="http://schemas.microsoft.com/office/word/2010/wordprocessingDrawing" xmlns:wp="http://schemas.openxmlformats.org/drawingml/2006/wordprocessingDrawing" xmlns:w10="urn:schemas-microsoft-com:office:word" xmlns:w="http://schemas.openxmlformats.org/wordprocessingml/2006/main" xmlns:w14="http://schemas.microsoft.com/office/word/2010/wordml" xmlns:w15="http://schemas.microsoft.com/office/word/2012/wordml" xmlns:w16cei="http://schemas.microsoft.com/office/word/2026/wordml/cei" xmlns:w16cex="http://schemas.microsoft.com/office/word/2018/wordml/cex" xmlns:w16cid="http://schemas.microsoft.com/office/word/2016/wordml/cid" xmlns:w16="http://schemas.microsoft.com/office/word/2018/wordml" xmlns:w16du="http://schemas.microsoft.com/office/word/2023/wordml/word16du" xmlns:w16sdtdh="http://schemas.microsoft.com/office/word/2020/wordml/sdtdatahash" xmlns:w16sdtfl="http://schemas.microsoft.com/office/word/2024/wordml/sdtformatlock" xmlns:w16se="http://schemas.microsoft.com/office/word/2015/wordml/symex" xmlns:wpg="http://schemas.microsoft.com/office/word/2010/wordprocessingGroup" xmlns:wpi="http://schemas.microsoft.com/office/word/2010/wordprocessingInk" xmlns:wne="http://schemas.microsoft.com/office/word/2006/wordml" xmlns:wps="http://schemas.microsoft.com/office/word/2010/wordprocessingShape" mc:Ignorable="w14 w15 w16se w16cid w16 w16cex w16sdtdh w16sdtfl w16du wp14">
   <w:abstractNum w:abstractNumId="0" w15:restartNumberingAfterBreak="0">
     <w:nsid w:val="22276E09"/>
     <w:multiLevelType w:val="hybridMultilevel"/>

</xml_diff>